<commit_message>
add slide for report week 1
</commit_message>
<xml_diff>
--- a/docs/BaoCaoGiaiThichCode_OpenGuardKids.docx
+++ b/docs/BaoCaoGiaiThichCode_OpenGuardKids.docx
@@ -2115,7 +2115,16 @@
         <w:t xml:space="preserve">include_router() </w:t>
       </w:r>
       <w:r>
-        <w:t>gắn nhóm API; mount('/static', ...) phục vụ CSS và JavaScript; đường dẫn / trả về dashboard/index.html. Middleware là lớp xử lý bao quanh request/response; ở đây nó bổ sung các header bảo mật và yêu cầu không lưu cache phản hồi API.</w:t>
+        <w:t xml:space="preserve">gắn nhóm API; </w:t>
+      </w:r>
+      <w:r>
+        <w:rPr>
+          <w:color w:val="92D050"/>
+        </w:rPr>
+        <w:t xml:space="preserve">mount('/static', ...) </w:t>
+      </w:r>
+      <w:r>
+        <w:t>phục vụ CSS và JavaScript; đường dẫn / trả về dashboard/index.html. Middleware là lớp xử lý bao quanh request/response; ở đây nó bổ sung các header bảo mật và yêu cầu không lưu cache phản hồi API.</w:t>
       </w:r>
     </w:p>
     <w:p>
@@ -2134,7 +2143,46 @@
     </w:p>
     <w:p>
       <w:r>
-        <w:t>File server/app/models.py mô tả các bảng bằng lớp Python. Model là mô hình dữ liệu; ORM là cơ chế ánh xạ giữa đối tượng Python và bảng database. SQLAlchemy đảm nhiệm phần ánh xạ này.</w:t>
+        <w:t xml:space="preserve">File </w:t>
+      </w:r>
+      <w:r>
+        <w:rPr>
+          <w:color w:val="92D050"/>
+        </w:rPr>
+        <w:t xml:space="preserve">server/app/models.py </w:t>
+      </w:r>
+      <w:r>
+        <w:t xml:space="preserve">mô tả các bảng bằng lớp Python. </w:t>
+      </w:r>
+      <w:r>
+        <w:rPr>
+          <w:b/>
+          <w:bCs/>
+        </w:rPr>
+        <w:t>Model</w:t>
+      </w:r>
+      <w:r>
+        <w:t xml:space="preserve"> là mô hình dữ liệu; </w:t>
+      </w:r>
+      <w:r>
+        <w:rPr>
+          <w:b/>
+          <w:bCs/>
+        </w:rPr>
+        <w:t>ORM</w:t>
+      </w:r>
+      <w:r>
+        <w:t xml:space="preserve"> là cơ chế ánh xạ giữa đối tượng Python và bảng database. </w:t>
+      </w:r>
+      <w:r>
+        <w:rPr>
+          <w:b/>
+          <w:bCs/>
+        </w:rPr>
+        <w:t>SQLAlchemy</w:t>
+      </w:r>
+      <w:r>
+        <w:t xml:space="preserve"> đảm nhiệm phần ánh xạ này.</w:t>
       </w:r>
     </w:p>
     <w:tbl>
@@ -2709,7 +2757,13 @@
     </w:p>
     <w:p>
       <w:r>
-        <w:t>server/app/database.py bật kiểm tra khóa ngoại và chế độ WAL của SQLite. WAL ghi thay đổi vào nhật ký trước, giúp việc đọc và ghi phối hợp tốt hơn; SQLite vẫn có giới hạn về ghi đồng thời. Database session ở đây là phiên làm việc với dữ liệu, khác phiên đăng nhập của phụ huynh.</w:t>
+        <w:rPr>
+          <w:color w:val="92D050"/>
+        </w:rPr>
+        <w:t xml:space="preserve">server/app/database.py </w:t>
+      </w:r>
+      <w:r>
+        <w:t>bật kiểm tra khóa ngoại và chế độ WAL của SQLite. WAL ghi thay đổi vào nhật ký trước, giúp việc đọc và ghi phối hợp tốt hơn; SQLite vẫn có giới hạn về ghi đồng thời. Database session ở đây là phiên làm việc với dữ liệu, khác phiên đăng nhập của phụ huynh.</w:t>
       </w:r>
     </w:p>
     <w:p>
@@ -2728,7 +2782,31 @@
     </w:p>
     <w:p>
       <w:r>
-        <w:t>server/seed.py tạo tài khoản phụ huynh ban đầu từ .env. Seed là thao tác nạp dữ liệu khởi tạo. Script không đổi mật khẩu của tài khoản đã tồn tại. Hàm login() trong server/app/routes.py xử lý đăng nhập.</w:t>
+        <w:rPr>
+          <w:color w:val="92D050"/>
+        </w:rPr>
+        <w:t xml:space="preserve">server/seed.py </w:t>
+      </w:r>
+      <w:r>
+        <w:t xml:space="preserve">tạo tài khoản phụ huynh ban đầu từ .env. Seed là thao tác nạp dữ liệu khởi tạo. Script không đổi mật khẩu của tài khoản đã tồn tại. Hàm </w:t>
+      </w:r>
+      <w:r>
+        <w:rPr>
+          <w:color w:val="92D050"/>
+        </w:rPr>
+        <w:t xml:space="preserve">login() </w:t>
+      </w:r>
+      <w:r>
+        <w:t xml:space="preserve">trong </w:t>
+      </w:r>
+      <w:r>
+        <w:rPr>
+          <w:color w:val="92D050"/>
+        </w:rPr>
+        <w:t>server/app/routes.py</w:t>
+      </w:r>
+      <w:r>
+        <w:t xml:space="preserve"> xử lý đăng nhập.</w:t>
       </w:r>
     </w:p>
     <w:p>
@@ -2753,9 +2831,35 @@
       <w:pPr>
         <w:pStyle w:val="Heading2"/>
       </w:pPr>
-      <w:r>
-        <w:t>Băm và mã hóa</w:t>
-      </w:r>
+      <w:proofErr w:type="spellStart"/>
+      <w:r>
+        <w:t>Băm</w:t>
+      </w:r>
+      <w:proofErr w:type="spellEnd"/>
+      <w:r>
+        <w:t xml:space="preserve"> </w:t>
+      </w:r>
+      <w:proofErr w:type="spellStart"/>
+      <w:r>
+        <w:t>và</w:t>
+      </w:r>
+      <w:proofErr w:type="spellEnd"/>
+      <w:r>
+        <w:t xml:space="preserve"> </w:t>
+      </w:r>
+      <w:proofErr w:type="spellStart"/>
+      <w:r>
+        <w:t>mã</w:t>
+      </w:r>
+      <w:proofErr w:type="spellEnd"/>
+      <w:r>
+        <w:t xml:space="preserve"> </w:t>
+      </w:r>
+      <w:proofErr w:type="spellStart"/>
+      <w:r>
+        <w:t>hóa</w:t>
+      </w:r>
+      <w:proofErr w:type="spellEnd"/>
     </w:p>
     <w:p>
       <w:r>
@@ -2763,8 +2867,29 @@
       </w:r>
     </w:p>
     <w:p>
-      <w:r>
-        <w:t>Không dùng SHA-256 đơn thuần thay Argon2id cho mật khẩu. Hai loại dữ liệu khác nhau: mật khẩu có thể dễ đoán, còn token được sinh ngẫu nhiên với độ dài đủ lớn.</w:t>
+      <w:proofErr w:type="spellStart"/>
+      <w:r>
+        <w:t>Không</w:t>
+      </w:r>
+      <w:proofErr w:type="spellEnd"/>
+      <w:r>
+        <w:t xml:space="preserve"> </w:t>
+      </w:r>
+      <w:proofErr w:type="spellStart"/>
+      <w:r>
+        <w:t>dùng</w:t>
+      </w:r>
+      <w:proofErr w:type="spellEnd"/>
+      <w:r>
+        <w:t xml:space="preserve"> SHA-256 </w:t>
+      </w:r>
+      <w:proofErr w:type="spellStart"/>
+      <w:r>
+        <w:t>đơn</w:t>
+      </w:r>
+      <w:proofErr w:type="spellEnd"/>
+      <w:r>
+        <w:t xml:space="preserve"> thuần thay Argon2id cho mật khẩu. Hai loại dữ liệu khác nhau: mật khẩu có thể dễ đoán, còn token được sinh ngẫu nhiên với độ dài đủ lớn.</w:t>
       </w:r>
     </w:p>
     <w:p>
@@ -3139,7 +3264,13 @@
     </w:p>
     <w:p>
       <w:r>
-        <w:t>server/app/security.py chứa các hàm tạo token, băm, kiểm tra mật khẩu và RateLimiter. Chưa có HTTPS, mã hóa trường nhạy cảm và hệ thống phân quyền đầy đủ của sản phẩm cuối.</w:t>
+        <w:rPr>
+          <w:color w:val="92D050"/>
+        </w:rPr>
+        <w:t xml:space="preserve">server/app/security.py </w:t>
+      </w:r>
+      <w:r>
+        <w:t>chứa các hàm tạo token, băm, kiểm tra mật khẩu và RateLimiter. Chưa có HTTPS, mã hóa trường nhạy cảm và hệ thống phân quyền đầy đủ của sản phẩm cuối.</w:t>
       </w:r>
     </w:p>
     <w:p>
@@ -3171,12 +3302,32 @@
     </w:p>
     <w:p>
       <w:r>
-        <w:t>Dashboard gọi POST /api/enrollment-codes với child_id và consent=true. Consent biểu thị xác nhận đồng ý. Server kiểm tra quyền sở hữu, tạo mã tám ký tự có hạn mười phút, lưu bản băm và ghi audit. Cấp mã mới cho cùng trẻ làm mã cũ mất hiệu lực.</w:t>
+        <w:t xml:space="preserve">Dashboard gọi POST /api/enrollment-codes với child_id và consent=true. </w:t>
+      </w:r>
+      <w:r>
+        <w:rPr>
+          <w:b/>
+          <w:bCs/>
+        </w:rPr>
+        <w:t>Consent</w:t>
+      </w:r>
+      <w:r>
+        <w:t xml:space="preserve"> biểu thị xác nhận đồng ý. Server kiểm tra quyền sở hữu, tạo mã tám ký tự có hạn mười phút, lưu bản băm và ghi audit. Cấp mã mới cho cùng trẻ làm mã cũ mất hiệu lực.</w:t>
       </w:r>
     </w:p>
     <w:p>
       <w:r>
-        <w:t>Agent gửi mã đến POST /api/enroll, kèm tên thiết bị và fingerprint. Trong simulator, fingerprint chỉ là UUID ngẫu nhiên; chưa phải dấu vân tay phần cứng hoặc ID cài đặt bền vững.</w:t>
+        <w:t xml:space="preserve">Agent gửi mã đến POST /api/enroll, kèm tên thiết bị và fingerprint. Trong simulator, </w:t>
+      </w:r>
+      <w:r>
+        <w:rPr>
+          <w:b/>
+          <w:bCs/>
+        </w:rPr>
+        <w:t>fingerprint chỉ là UUID ngẫu nhiên</w:t>
+      </w:r>
+      <w:r>
+        <w:t>; chưa phải dấu vân tay phần cứng hoặc ID cài đặt bền vững.</w:t>
       </w:r>
     </w:p>
     <w:p>
@@ -3591,7 +3742,75 @@
     </w:p>
     <w:p>
       <w:r>
-        <w:t>Heartbeat là thông điệp định kỳ báo agent còn liên lạc được với server. Hàm Simulator.tick() trong agent/simulator.py đọc cache, gửi phiên bản hiện tại và tải policy nếu server có phiên bản khác.</w:t>
+        <w:t xml:space="preserve">Heartbeat là thông điệp định kỳ báo agent còn liên lạc được với server. </w:t>
+      </w:r>
+      <w:proofErr w:type="spellStart"/>
+      <w:r>
+        <w:t>Hàm</w:t>
+      </w:r>
+      <w:proofErr w:type="spellEnd"/>
+      <w:r>
+        <w:t xml:space="preserve"> </w:t>
+      </w:r>
+      <w:proofErr w:type="spellStart"/>
+      <w:r>
+        <w:rPr>
+          <w:i/>
+          <w:iCs/>
+        </w:rPr>
+        <w:t>Simulator.tick</w:t>
+      </w:r>
+      <w:proofErr w:type="spellEnd"/>
+      <w:r>
+        <w:rPr>
+          <w:i/>
+          <w:iCs/>
+        </w:rPr>
+        <w:t>()</w:t>
+      </w:r>
+      <w:r>
+        <w:t xml:space="preserve"> </w:t>
+      </w:r>
+      <w:proofErr w:type="spellStart"/>
+      <w:r>
+        <w:t>trong</w:t>
+      </w:r>
+      <w:proofErr w:type="spellEnd"/>
+      <w:r>
+        <w:t xml:space="preserve"> </w:t>
+      </w:r>
+      <w:r>
+        <w:rPr>
+          <w:color w:val="92D050"/>
+        </w:rPr>
+        <w:t xml:space="preserve">agent/simulator.py </w:t>
+      </w:r>
+      <w:proofErr w:type="spellStart"/>
+      <w:r>
+        <w:t>đọc</w:t>
+      </w:r>
+      <w:proofErr w:type="spellEnd"/>
+      <w:r>
+        <w:t xml:space="preserve"> cache, gửi phiên bản hiện tại </w:t>
+      </w:r>
+      <w:proofErr w:type="spellStart"/>
+      <w:proofErr w:type="gramStart"/>
+      <w:r>
+        <w:t>và</w:t>
+      </w:r>
+      <w:r>
+        <w:t>git</w:t>
+      </w:r>
+      <w:proofErr w:type="spellEnd"/>
+      <w:r>
+        <w:t xml:space="preserve"> </w:t>
+      </w:r>
+      <w:r>
+        <w:t xml:space="preserve"> tải</w:t>
+      </w:r>
+      <w:proofErr w:type="gramEnd"/>
+      <w:r>
+        <w:t xml:space="preserve"> policy nếu server có phiên bản khác.</w:t>
       </w:r>
     </w:p>
     <w:p>
@@ -3662,7 +3881,33 @@
     </w:p>
     <w:p>
       <w:r>
-        <w:t>Dashboard gửi expected_version=1, weekday_minutes=60 và weekend_minutes=120. Hàm update_policy() kiểm tra quyền, cập nhật quota và tăng version lên 2. Agent phát hiện ở heartbeat tiếp theo rồi tải policy mới. Việc này mới đồng bộ cấu hình, chưa giới hạn thời gian sử dụng thật.</w:t>
+        <w:t xml:space="preserve">Dashboard gửi expected_version=1, weekday_minutes=60 và weekend_minutes=120. Hàm </w:t>
+      </w:r>
+      <w:r>
+        <w:rPr>
+          <w:i/>
+          <w:iCs/>
+        </w:rPr>
+        <w:t>update_</w:t>
+      </w:r>
+      <w:proofErr w:type="gramStart"/>
+      <w:r>
+        <w:rPr>
+          <w:i/>
+          <w:iCs/>
+        </w:rPr>
+        <w:t>policy(</w:t>
+      </w:r>
+      <w:proofErr w:type="gramEnd"/>
+      <w:r>
+        <w:rPr>
+          <w:i/>
+          <w:iCs/>
+        </w:rPr>
+        <w:t>)</w:t>
+      </w:r>
+      <w:r>
+        <w:t xml:space="preserve"> kiểm tra quyền, cập nhật quota và tăng version lên 2. Agent phát hiện ở heartbeat tiếp theo rồi tải policy mới. Việc này mới đồng bộ cấu hình, chưa giới hạn thời gian sử dụng thật.</w:t>
       </w:r>
     </w:p>
     <w:p>
@@ -3690,12 +3935,72 @@
     </w:p>
     <w:p>
       <w:r>
-        <w:t>agent/cache.py cung cấp PolicyCache.load() và save(). SQLite cục bộ tại data/agent/policy.db giữ policy gần nhất. Khi mất kết nối trong vòng lặp đồng bộ, simulator báo offline, giữ cache và thử lại ở nhịp sau. Lỗi xác thực hoặc phản hồi HTTP bị từ chối có thể làm chương trình dừng.</w:t>
+        <w:rPr>
+          <w:color w:val="92D050"/>
+        </w:rPr>
+        <w:t xml:space="preserve">agent/cache.py </w:t>
+      </w:r>
+      <w:r>
+        <w:t xml:space="preserve">cung cấp </w:t>
+      </w:r>
+      <w:r>
+        <w:rPr>
+          <w:i/>
+          <w:iCs/>
+        </w:rPr>
+        <w:t>PolicyCache.load()</w:t>
+      </w:r>
+      <w:r>
+        <w:t xml:space="preserve"> và </w:t>
+      </w:r>
+      <w:proofErr w:type="gramStart"/>
+      <w:r>
+        <w:rPr>
+          <w:i/>
+          <w:iCs/>
+        </w:rPr>
+        <w:t>save(</w:t>
+      </w:r>
+      <w:proofErr w:type="gramEnd"/>
+      <w:r>
+        <w:rPr>
+          <w:i/>
+          <w:iCs/>
+        </w:rPr>
+        <w:t>).</w:t>
+      </w:r>
+      <w:r>
+        <w:t xml:space="preserve"> SQLite cục bộ tại </w:t>
+      </w:r>
+      <w:r>
+        <w:rPr>
+          <w:color w:val="92D050"/>
+        </w:rPr>
+        <w:t xml:space="preserve">data/agent/policy.db </w:t>
+      </w:r>
+      <w:r>
+        <w:t>giữ policy gần nhất. Khi mất kết nối trong vòng lặp đồng bộ, simulator báo offline, giữ cache và thử lại ở nhịp sau. Lỗi xác thực hoặc phản hồi HTTP bị từ chối có thể làm chương trình dừng.</w:t>
       </w:r>
     </w:p>
     <w:p>
-      <w:r>
-        <w:t>time.monotonic() là đồng hồ đo khoảng thời gian không dựa vào giờ lịch người dùng chỉnh. Code dùng nó cho chu kỳ và thời điểm refresh token. Chưa có bộ đếm quota nên chưa thể kết luận đã chống chỉnh đồng hồ cho hạn mức sử dụng.</w:t>
+      <w:proofErr w:type="gramStart"/>
+      <w:r>
+        <w:rPr>
+          <w:i/>
+          <w:iCs/>
+        </w:rPr>
+        <w:t>time.monotonic</w:t>
+      </w:r>
+      <w:proofErr w:type="gramEnd"/>
+      <w:r>
+        <w:rPr>
+          <w:i/>
+          <w:iCs/>
+        </w:rPr>
+        <w:t>()</w:t>
+      </w:r>
+      <w:r>
+        <w:t xml:space="preserve"> là đồng hồ đo khoảng thời gian không dựa vào giờ lịch người dùng chỉnh. Code dùng nó cho chu kỳ và thời điểm refresh token. Chưa có bộ đếm quota nên chưa thể kết luận đã chống chỉnh đồng hồ cho hạn mức sử dụng.</w:t>
       </w:r>
     </w:p>
     <w:p>
@@ -3718,8 +4023,53 @@
       </w:r>
     </w:p>
     <w:p>
-      <w:r>
-        <w:t>dashboard/index.html định nghĩa các ô nhập, nút và vùng hiển thị. static/style.css quy định bố cục và màu sắc. static/app.js xử lý thao tác và gọi API. Giao diện hiện dùng JavaScript thuần, chưa dùng React hoặc HTMX.</w:t>
+      <w:pPr>
+        <w:rPr>
+          <w:lang w:val="en-GB"/>
+        </w:rPr>
+      </w:pPr>
+      <w:r>
+        <w:rPr>
+          <w:color w:val="92D050"/>
+        </w:rPr>
+        <w:t xml:space="preserve">dashboard/index.html </w:t>
+      </w:r>
+      <w:r>
+        <w:t>định nghĩa các ô nhập, nút và vùng hiển thị</w:t>
+      </w:r>
+      <w:r>
+        <w:rPr>
+          <w:color w:val="92D050"/>
+        </w:rPr>
+        <w:t xml:space="preserve">. static/style.css </w:t>
+      </w:r>
+      <w:r>
+        <w:t xml:space="preserve">quy định bố cục và màu sắc. </w:t>
+      </w:r>
+      <w:r>
+        <w:rPr>
+          <w:color w:val="92D050"/>
+        </w:rPr>
+        <w:t xml:space="preserve">static/app.js </w:t>
+      </w:r>
+      <w:r>
+        <w:t xml:space="preserve">xử lý thao tác và gọi API. Giao diện hiện dùng JavaScript thuần, chưa </w:t>
+      </w:r>
+      <w:proofErr w:type="spellStart"/>
+      <w:r>
+        <w:t>dùng</w:t>
+      </w:r>
+      <w:proofErr w:type="spellEnd"/>
+      <w:r>
+        <w:t xml:space="preserve"> React </w:t>
+      </w:r>
+      <w:proofErr w:type="spellStart"/>
+      <w:r>
+        <w:t>hoặc</w:t>
+      </w:r>
+      <w:proofErr w:type="spellEnd"/>
+      <w:r>
+        <w:t xml:space="preserve"> HTMX.</w:t>
       </w:r>
     </w:p>
     <w:tbl>
@@ -3763,12 +4113,37 @@
             <w:pPr>
               <w:spacing w:before="60" w:after="60" w:line="252" w:lineRule="auto"/>
             </w:pPr>
+            <w:proofErr w:type="spellStart"/>
             <w:r>
               <w:rPr>
                 <w:b/>
                 <w:sz w:val="18"/>
               </w:rPr>
-              <w:t>Hàm trong app.js</w:t>
+              <w:t>Hàm</w:t>
+            </w:r>
+            <w:proofErr w:type="spellEnd"/>
+            <w:r>
+              <w:rPr>
+                <w:b/>
+                <w:sz w:val="18"/>
+              </w:rPr>
+              <w:t xml:space="preserve"> </w:t>
+            </w:r>
+            <w:proofErr w:type="spellStart"/>
+            <w:r>
+              <w:rPr>
+                <w:b/>
+                <w:sz w:val="18"/>
+              </w:rPr>
+              <w:t>trong</w:t>
+            </w:r>
+            <w:proofErr w:type="spellEnd"/>
+            <w:r>
+              <w:rPr>
+                <w:b/>
+                <w:sz w:val="18"/>
+              </w:rPr>
+              <w:t xml:space="preserve"> app.js</w:t>
             </w:r>
           </w:p>
         </w:tc>
@@ -4148,12 +4523,24 @@
     </w:p>
     <w:p>
       <w:r>
-        <w:t>server/app/schemas.py mô tả schema, tức cấu trúc dữ liệu đầu vào. Pydantic kiểm tra kiểu và phạm vi. weekday_minutes: int = Field(ge=1, le=1440) quy định số nguyên từ 1 đến 1440. extra='forbid' từ chối trường không được khai báo.</w:t>
+        <w:rPr>
+          <w:color w:val="92D050"/>
+        </w:rPr>
+        <w:t xml:space="preserve">server/app/schemas.py </w:t>
+      </w:r>
+      <w:r>
+        <w:t>mô tả schema, tức cấu trúc dữ liệu đầu vào. Pydantic kiểm tra kiểu và phạm vi. weekday_minutes: int = Field(ge=1, le=1440) quy định số nguyên từ 1 đến 1440. extra='forbid' từ chối trường không được khai báo.</w:t>
       </w:r>
     </w:p>
     <w:p>
       <w:r>
-        <w:t>server/app/dependencies.py chứa current_parent(), current_device() và owned_child(). Dependency injection là cách FastAPI cung cấp thành phần cần thiết trước khi chạy hàm API, như phiên database và kết quả kiểm tra đăng nhập. Tham số auth: ParentAuth yêu cầu kiểm tra phiên phụ huynh.</w:t>
+        <w:rPr>
+          <w:color w:val="92D050"/>
+        </w:rPr>
+        <w:t>server/app/dependencies.py</w:t>
+      </w:r>
+      <w:r>
+        <w:t xml:space="preserve"> chứa current_parent(), current_device() và owned_child(). Dependency injection là cách FastAPI cung cấp thành phần cần thiết trước khi chạy hàm API, như phiên database và kết quả kiểm tra đăng nhập. Tham số auth: ParentAuth yêu cầu kiểm tra phiên phụ huynh.</w:t>
       </w:r>
     </w:p>
     <w:tbl>

</xml_diff>